<commit_message>
Fill in branch, section and registration number on report cover
Co-Authored-By: Claude Opus 5.5 <noreply@anthropic.com>
Claude-Session: https://claude.ai/code/session_01WzrheKaP8T74DD4z7H9PiN
</commit_message>
<xml_diff>
--- a/report/FinBERT_Mini_Project_Report.docx
+++ b/report/FinBERT_Mini_Project_Report.docx
@@ -109,9 +109,8 @@
         <w:rPr>
           <w:b/>
           <w:sz w:val="30"/>
-          <w:highlight w:val="yellow"/>
         </w:rPr>
-        <w:t>&lt;Branch&gt; &lt;Section&gt;</w:t>
+        <w:t>CSE (Artificial Intelligence) – Section AI-A</w:t>
       </w:r>
     </w:p>
     <w:p>
@@ -150,9 +149,8 @@
       <w:r>
         <w:rPr>
           <w:sz w:val="22"/>
-          <w:highlight w:val="yellow"/>
         </w:rPr>
-        <w:t>&lt;Reg. No.&gt;</w:t>
+        <w:t>Reg. No. 245890320</w:t>
       </w:r>
     </w:p>
     <w:p>

</xml_diff>

<commit_message>
Remove guidance section from report cover
Co-Authored-By: Claude Opus 5.5 <noreply@anthropic.com>
Claude-Session: https://claude.ai/code/session_01WzrheKaP8T74DD4z7H9PiN
</commit_message>
<xml_diff>
--- a/report/FinBERT_Mini_Project_Report.docx
+++ b/report/FinBERT_Mini_Project_Report.docx
@@ -155,77 +155,7 @@
     </w:p>
     <w:p>
       <w:pPr>
-        <w:spacing w:after="280" w:before="0" w:line="276" w:lineRule="auto"/>
-        <w:jc w:val="center"/>
-      </w:pPr>
-      <w:r>
-        <w:rPr>
-          <w:b w:val="0"/>
-          <w:i/>
-          <w:sz w:val="26"/>
-        </w:rPr>
-        <w:t>Under the guidance of</w:t>
-      </w:r>
-    </w:p>
-    <w:p>
-      <w:pPr>
-        <w:spacing w:after="0" w:before="0" w:line="276" w:lineRule="auto"/>
-        <w:jc w:val="center"/>
-      </w:pPr>
-      <w:r>
-        <w:rPr>
-          <w:b/>
-          <w:i w:val="0"/>
-          <w:sz w:val="24"/>
-        </w:rPr>
-        <w:t>Dr. Mahadevi S.</w:t>
-      </w:r>
-    </w:p>
-    <w:p>
-      <w:pPr>
-        <w:spacing w:after="0" w:before="0" w:line="276" w:lineRule="auto"/>
-        <w:jc w:val="center"/>
-      </w:pPr>
-      <w:r>
-        <w:rPr>
-          <w:b w:val="0"/>
-          <w:i w:val="0"/>
-          <w:sz w:val="24"/>
-        </w:rPr>
-        <w:t>Assistant Professor</w:t>
-      </w:r>
-    </w:p>
-    <w:p>
-      <w:pPr>
-        <w:spacing w:after="0" w:before="0" w:line="276" w:lineRule="auto"/>
-        <w:jc w:val="center"/>
-      </w:pPr>
-      <w:r>
-        <w:rPr>
-          <w:b w:val="0"/>
-          <w:i w:val="0"/>
-          <w:sz w:val="24"/>
-        </w:rPr>
-        <w:t>School of Computer Engineering</w:t>
-      </w:r>
-    </w:p>
-    <w:p>
-      <w:pPr>
-        <w:spacing w:after="0" w:before="0" w:line="276" w:lineRule="auto"/>
-        <w:jc w:val="center"/>
-      </w:pPr>
-      <w:r>
-        <w:rPr>
-          <w:b w:val="0"/>
-          <w:i w:val="0"/>
-          <w:sz w:val="24"/>
-        </w:rPr>
-        <w:t>Manipal Institute of Technology, Bengaluru</w:t>
-      </w:r>
-    </w:p>
-    <w:p>
-      <w:pPr>
-        <w:spacing w:after="1200" w:before="720" w:line="240" w:lineRule="auto"/>
+        <w:spacing w:after="2200" w:before="1800" w:line="240" w:lineRule="auto"/>
         <w:jc w:val="center"/>
       </w:pPr>
       <w:r>

</xml_diff>